<commit_message>
release: deliver audited PTE extension suite
</commit_message>
<xml_diff>
--- a/PNE.ProductionOrderReconciliation/Layouts/PNEPILChangeProposal.docx
+++ b/PNE.ProductionOrderReconciliation/Layouts/PNEPILChangeProposal.docx
@@ -1,6 +1,6 @@
 
 <file path=word/document.xml><?xml version="1.0" encoding="utf-8"?>
-<w:document xmlns:mc="http://schemas.openxmlformats.org/markup-compatibility/2006" xmlns:r="http://schemas.openxmlformats.org/officeDocument/2006/relationships" xmlns:w="http://schemas.openxmlformats.org/wordprocessingml/2006/main" xmlns:w15="http://schemas.microsoft.com/office/word/2012/wordml" mc:Ignorable="w15">
+<w:document xmlns:ns1="http://schemas.openxmlformats.org/markup-compatibility/2006" xmlns:ns3="http://schemas.openxmlformats.org/officeDocument/2006/relationships" xmlns:w="http://schemas.openxmlformats.org/wordprocessingml/2006/main" xmlns:w15="http://schemas.microsoft.com/office/word/2012/wordml" ns1:Ignorable="w15">
   <w:body>
     <w:p>
       <w:pPr>
@@ -4270,6 +4270,817 @@
     </w:tbl>
     <w:p>
       <w:pPr>
+        <w:spacing w:before="150" w:after="45" w:line="240" w:lineRule="auto"/>
+        <w:keepNext/>
+      </w:pPr>
+      <w:r>
+        <w:rPr>
+          <w:rFonts w:ascii="Segoe UI" w:hAnsi="Segoe UI"/>
+          <w:sz w:val="20"/>
+          <w:color w:val="0B2545"/>
+          <w:b/>
+        </w:rPr>
+        <w:t xml:space="preserve">Audit handmatig vrijgegeven commerciële koppelingen</w:t>
+      </w:r>
+    </w:p>
+    <w:p>
+      <w:pPr>
+        <w:spacing w:before="75" w:after="0" w:line="240" w:lineRule="auto"/>
+      </w:pPr>
+      <w:r>
+        <w:rPr>
+          <w:rFonts w:ascii="Segoe UI" w:hAnsi="Segoe UI"/>
+          <w:sz w:val="14"/>
+          <w:color w:val="5B6573"/>
+          <w:i/>
+        </w:rPr>
+        <w:t xml:space="preserve">Wanneer een gekoppelde offerte of offertregel niet meer veilig automatisch kan worden gecontroleerd, kan de koppeling na handmatige commerciële beoordeling worden vrijgegeven. Verkoop wordt niet gewijzigd; toestand, reden, gebruiker en tijd blijven hieronder bewaard.</w:t>
+      </w:r>
+    </w:p>
+    <w:tbl>
+      <w:tblPr>
+        <w:tblW w:w="15598" w:type="dxa"/>
+        <w:jc w:val="left"/>
+        <w:tblLayout w:type="fixed"/>
+        <w:tblInd w:w="0" w:type="dxa"/>
+        <w:tblCellMar/>
+      </w:tblPr>
+      <w:tblGrid>
+        <w:gridCol w:w="2500"/>
+        <w:gridCol w:w="3800"/>
+        <w:gridCol w:w="1600"/>
+        <w:gridCol w:w="850"/>
+        <w:gridCol w:w="1050"/>
+        <w:gridCol w:w="5798"/>
+      </w:tblGrid>
+      <w:tr>
+        <w:trPr>
+          <w:tblHeader/>
+        </w:trPr>
+        <w:tc>
+          <w:tcPr>
+            <w:tcW w:w="2500" w:type="dxa"/>
+            <w:vAlign w:val="center"/>
+            <w:tcMar>
+              <w:top w:w="70" w:type="dxa"/>
+              <w:start w:w="90" w:type="dxa"/>
+              <w:bottom w:w="70" w:type="dxa"/>
+              <w:end w:w="90" w:type="dxa"/>
+            </w:tcMar>
+            <w:shd w:val="clear" w:color="auto" w:fill="E8EEF5"/>
+            <w:tcBorders>
+              <w:top w:val="single" w:color="9AA7B6" w:sz="3" w:space="0"/>
+              <w:start w:val="single" w:color="9AA7B6" w:sz="3" w:space="0"/>
+              <w:bottom w:val="single" w:color="9AA7B6" w:sz="3" w:space="0"/>
+              <w:end w:val="single" w:color="9AA7B6" w:sz="3" w:space="0"/>
+            </w:tcBorders>
+          </w:tcPr>
+          <w:p>
+            <w:pPr>
+              <w:spacing w:before="0" w:after="0" w:line="220" w:lineRule="auto"/>
+              <w:jc w:val="left"/>
+            </w:pPr>
+            <w:r>
+              <w:rPr>
+                <w:rFonts w:ascii="Segoe UI" w:hAnsi="Segoe UI"/>
+                <w:sz w:val="15"/>
+                <w:color w:val="0B2545"/>
+                <w:b/>
+              </w:rPr>
+              <w:t xml:space="preserve">Auditnr.</w:t>
+            </w:r>
+          </w:p>
+        </w:tc>
+        <w:tc>
+          <w:tcPr>
+            <w:tcW w:w="3800" w:type="dxa"/>
+            <w:vAlign w:val="center"/>
+            <w:tcMar>
+              <w:top w:w="70" w:type="dxa"/>
+              <w:start w:w="90" w:type="dxa"/>
+              <w:bottom w:w="70" w:type="dxa"/>
+              <w:end w:w="90" w:type="dxa"/>
+            </w:tcMar>
+            <w:shd w:val="clear" w:color="auto" w:fill="E8EEF5"/>
+            <w:tcBorders>
+              <w:top w:val="single" w:color="9AA7B6" w:sz="3" w:space="0"/>
+              <w:start w:val="single" w:color="9AA7B6" w:sz="3" w:space="0"/>
+              <w:bottom w:val="single" w:color="9AA7B6" w:sz="3" w:space="0"/>
+              <w:end w:val="single" w:color="9AA7B6" w:sz="3" w:space="0"/>
+            </w:tcBorders>
+          </w:tcPr>
+          <w:p>
+            <w:pPr>
+              <w:spacing w:before="0" w:after="0" w:line="220" w:lineRule="auto"/>
+              <w:jc w:val="left"/>
+            </w:pPr>
+            <w:r>
+              <w:rPr>
+                <w:rFonts w:ascii="Segoe UI" w:hAnsi="Segoe UI"/>
+                <w:sz w:val="15"/>
+                <w:color w:val="0B2545"/>
+                <w:b/>
+              </w:rPr>
+              <w:t xml:space="preserve">Offerte / regel / prijs</w:t>
+            </w:r>
+          </w:p>
+        </w:tc>
+        <w:tc>
+          <w:tcPr>
+            <w:tcW w:w="1600" w:type="dxa"/>
+            <w:vAlign w:val="center"/>
+            <w:tcMar>
+              <w:top w:w="70" w:type="dxa"/>
+              <w:start w:w="90" w:type="dxa"/>
+              <w:bottom w:w="70" w:type="dxa"/>
+              <w:end w:w="90" w:type="dxa"/>
+            </w:tcMar>
+            <w:shd w:val="clear" w:color="auto" w:fill="E8EEF5"/>
+            <w:tcBorders>
+              <w:top w:val="single" w:color="9AA7B6" w:sz="3" w:space="0"/>
+              <w:start w:val="single" w:color="9AA7B6" w:sz="3" w:space="0"/>
+              <w:bottom w:val="single" w:color="9AA7B6" w:sz="3" w:space="0"/>
+              <w:end w:val="single" w:color="9AA7B6" w:sz="3" w:space="0"/>
+            </w:tcBorders>
+          </w:tcPr>
+          <w:p>
+            <w:pPr>
+              <w:spacing w:before="0" w:after="0" w:line="220" w:lineRule="auto"/>
+              <w:jc w:val="left"/>
+            </w:pPr>
+            <w:r>
+              <w:rPr>
+                <w:rFonts w:ascii="Segoe UI" w:hAnsi="Segoe UI"/>
+                <w:sz w:val="15"/>
+                <w:color w:val="0B2545"/>
+                <w:b/>
+              </w:rPr>
+              <w:t xml:space="preserve">Carrier / variant / eenheid</w:t>
+            </w:r>
+          </w:p>
+        </w:tc>
+        <w:tc>
+          <w:tcPr>
+            <w:tcW w:w="850" w:type="dxa"/>
+            <w:vAlign w:val="center"/>
+            <w:tcMar>
+              <w:top w:w="70" w:type="dxa"/>
+              <w:start w:w="90" w:type="dxa"/>
+              <w:bottom w:w="70" w:type="dxa"/>
+              <w:end w:w="90" w:type="dxa"/>
+            </w:tcMar>
+            <w:shd w:val="clear" w:color="auto" w:fill="E8EEF5"/>
+            <w:tcBorders>
+              <w:top w:val="single" w:color="9AA7B6" w:sz="3" w:space="0"/>
+              <w:start w:val="single" w:color="9AA7B6" w:sz="3" w:space="0"/>
+              <w:bottom w:val="single" w:color="9AA7B6" w:sz="3" w:space="0"/>
+              <w:end w:val="single" w:color="9AA7B6" w:sz="3" w:space="0"/>
+            </w:tcBorders>
+          </w:tcPr>
+          <w:p>
+            <w:pPr>
+              <w:spacing w:before="0" w:after="0" w:line="220" w:lineRule="auto"/>
+              <w:jc w:val="right"/>
+            </w:pPr>
+            <w:r>
+              <w:rPr>
+                <w:rFonts w:ascii="Segoe UI" w:hAnsi="Segoe UI"/>
+                <w:sz w:val="15"/>
+                <w:color w:val="0B2545"/>
+                <w:b/>
+              </w:rPr>
+              <w:t xml:space="preserve">Aantal</w:t>
+            </w:r>
+          </w:p>
+        </w:tc>
+        <w:tc>
+          <w:tcPr>
+            <w:tcW w:w="1050" w:type="dxa"/>
+            <w:vAlign w:val="center"/>
+            <w:tcMar>
+              <w:top w:w="70" w:type="dxa"/>
+              <w:start w:w="90" w:type="dxa"/>
+              <w:bottom w:w="70" w:type="dxa"/>
+              <w:end w:w="90" w:type="dxa"/>
+            </w:tcMar>
+            <w:shd w:val="clear" w:color="auto" w:fill="E8EEF5"/>
+            <w:tcBorders>
+              <w:top w:val="single" w:color="9AA7B6" w:sz="3" w:space="0"/>
+              <w:start w:val="single" w:color="9AA7B6" w:sz="3" w:space="0"/>
+              <w:bottom w:val="single" w:color="9AA7B6" w:sz="3" w:space="0"/>
+              <w:end w:val="single" w:color="9AA7B6" w:sz="3" w:space="0"/>
+            </w:tcBorders>
+          </w:tcPr>
+          <w:p>
+            <w:pPr>
+              <w:spacing w:before="0" w:after="0" w:line="220" w:lineRule="auto"/>
+              <w:jc w:val="right"/>
+            </w:pPr>
+            <w:r>
+              <w:rPr>
+                <w:rFonts w:ascii="Segoe UI" w:hAnsi="Segoe UI"/>
+                <w:sz w:val="15"/>
+                <w:color w:val="0B2545"/>
+                <w:b/>
+              </w:rPr>
+              <w:t xml:space="preserve">Toestand / vrijgegeven door / op</w:t>
+            </w:r>
+          </w:p>
+        </w:tc>
+        <w:tc>
+          <w:tcPr>
+            <w:tcW w:w="5798" w:type="dxa"/>
+            <w:vAlign w:val="center"/>
+            <w:tcMar>
+              <w:top w:w="70" w:type="dxa"/>
+              <w:start w:w="90" w:type="dxa"/>
+              <w:bottom w:w="70" w:type="dxa"/>
+              <w:end w:w="90" w:type="dxa"/>
+            </w:tcMar>
+            <w:shd w:val="clear" w:color="auto" w:fill="E8EEF5"/>
+            <w:tcBorders>
+              <w:top w:val="single" w:color="9AA7B6" w:sz="3" w:space="0"/>
+              <w:start w:val="single" w:color="9AA7B6" w:sz="3" w:space="0"/>
+              <w:bottom w:val="single" w:color="9AA7B6" w:sz="3" w:space="0"/>
+              <w:end w:val="single" w:color="9AA7B6" w:sz="3" w:space="0"/>
+            </w:tcBorders>
+          </w:tcPr>
+          <w:p>
+            <w:pPr>
+              <w:spacing w:before="0" w:after="0" w:line="220" w:lineRule="auto"/>
+              <w:jc w:val="left"/>
+            </w:pPr>
+            <w:r>
+              <w:rPr>
+                <w:rFonts w:ascii="Segoe UI" w:hAnsi="Segoe UI"/>
+                <w:sz w:val="15"/>
+                <w:color w:val="0B2545"/>
+                <w:b/>
+              </w:rPr>
+              <w:t xml:space="preserve">Reden</w:t>
+            </w:r>
+          </w:p>
+        </w:tc>
+      </w:tr>
+      <w:sdt>
+        <w:sdtPr>
+          <w:alias w:val="#Nav: /PNEPILHeader/PNEPILQuoteResolution"/>
+          <w:tag w:val="#Nav: PNE_PIL_Change_Proposal/50196"/>
+          <w:id w:val="100201"/>
+          <w15:dataBinding w:prefixMappings="xmlns:ns0='urn:microsoft-dynamics-nav/reports/PNE_PIL_Change_Proposal/50196/'" w:xpath="/ns0:NavWordReportXmlPart[1]/ns0:PNEPILHeader[1]/ns0:PNEPILQuoteResolution" w:storeItemID="{D387A1D4-2CF1-49BE-83C5-FBD62A1E97C0}"/>
+          <w15:repeatingSection/>
+        </w:sdtPr>
+        <w:sdtContent>
+          <w:sdt>
+            <w:sdtPr>
+              <w:id w:val="100202"/>
+              <w15:repeatingSectionItem/>
+            </w:sdtPr>
+            <w:sdtContent>
+              <w:tr>
+                <w:tc>
+                  <w:tcPr>
+                    <w:tcW w:w="2500" w:type="dxa"/>
+                    <w:vAlign w:val="center"/>
+                    <w:tcMar>
+                      <w:top w:w="70" w:type="dxa"/>
+                      <w:start w:w="90" w:type="dxa"/>
+                      <w:bottom w:w="70" w:type="dxa"/>
+                      <w:end w:w="90" w:type="dxa"/>
+                    </w:tcMar>
+                    <w:tcBorders>
+                      <w:top w:val="single" w:color="D7DEE7" w:sz="3" w:space="0"/>
+                      <w:start w:val="single" w:color="D7DEE7" w:sz="3" w:space="0"/>
+                      <w:bottom w:val="single" w:color="D7DEE7" w:sz="3" w:space="0"/>
+                      <w:end w:val="single" w:color="D7DEE7" w:sz="3" w:space="0"/>
+                    </w:tcBorders>
+                  </w:tcPr>
+                  <w:p>
+                    <w:pPr>
+                      <w:spacing w:before="0" w:after="0" w:line="220" w:lineRule="auto"/>
+                      <w:jc w:val="left"/>
+                    </w:pPr>
+                    <w:sdt>
+                      <w:sdtPr>
+                        <w:alias w:val="#Nav: /PNEPILHeader/PNEPILQuoteResolution/ResolutionEntryNo"/>
+                        <w:tag w:val="#Nav: PNE_PIL_Change_Proposal/50196"/>
+                        <w:id w:val="100203"/>
+                        <w15:dataBinding w:prefixMappings="xmlns:ns0='urn:microsoft-dynamics-nav/reports/PNE_PIL_Change_Proposal/50196/' " w:xpath="/ns0:NavWordReportXmlPart[1]/ns0:PNEPILHeader[1]/ns0:PNEPILQuoteResolution[1]/ns0:ResolutionEntryNo[1]" w:storeItemID="{D387A1D4-2CF1-49BE-83C5-FBD62A1E97C0}"/>
+                        <w:text/>
+                      </w:sdtPr>
+                      <w:sdtContent>
+                        <w:r>
+                          <w:rPr>
+                            <w:rFonts w:ascii="Segoe UI" w:hAnsi="Segoe UI"/>
+                            <w:sz w:val="15"/>
+                            <w:color w:val="1F2937"/>
+                          </w:rPr>
+                          <w:t xml:space="preserve">2</w:t>
+                        </w:r>
+                      </w:sdtContent>
+                    </w:sdt>
+                  </w:p>
+                </w:tc>
+                <w:tc>
+                  <w:tcPr>
+                    <w:tcW w:w="3800" w:type="dxa"/>
+                    <w:vAlign w:val="center"/>
+                    <w:tcMar>
+                      <w:top w:w="70" w:type="dxa"/>
+                      <w:start w:w="90" w:type="dxa"/>
+                      <w:bottom w:w="70" w:type="dxa"/>
+                      <w:end w:w="90" w:type="dxa"/>
+                    </w:tcMar>
+                    <w:tcBorders>
+                      <w:top w:val="single" w:color="D7DEE7" w:sz="3" w:space="0"/>
+                      <w:start w:val="single" w:color="D7DEE7" w:sz="3" w:space="0"/>
+                      <w:bottom w:val="single" w:color="D7DEE7" w:sz="3" w:space="0"/>
+                      <w:end w:val="single" w:color="D7DEE7" w:sz="3" w:space="0"/>
+                    </w:tcBorders>
+                  </w:tcPr>
+                  <w:p>
+                    <w:pPr>
+                      <w:spacing w:before="0" w:after="0" w:line="220" w:lineRule="auto"/>
+                      <w:jc w:val="left"/>
+                    </w:pPr>
+                    <w:sdt>
+                      <w:sdtPr>
+                        <w:alias w:val="#Nav: /PNEPILHeader/PNEPILQuoteResolution/ResolutionSalesQuoteNo"/>
+                        <w:tag w:val="#Nav: PNE_PIL_Change_Proposal/50196"/>
+                        <w:id w:val="100204"/>
+                        <w15:dataBinding w:prefixMappings="xmlns:ns0='urn:microsoft-dynamics-nav/reports/PNE_PIL_Change_Proposal/50196/' " w:xpath="/ns0:NavWordReportXmlPart[1]/ns0:PNEPILHeader[1]/ns0:PNEPILQuoteResolution[1]/ns0:ResolutionSalesQuoteNo[1]" w:storeItemID="{D387A1D4-2CF1-49BE-83C5-FBD62A1E97C0}"/>
+                        <w:text/>
+                      </w:sdtPr>
+                      <w:sdtContent>
+                        <w:r>
+                          <w:rPr>
+                            <w:rFonts w:ascii="Segoe UI" w:hAnsi="Segoe UI"/>
+                            <w:sz w:val="15"/>
+                            <w:color w:val="1F2937"/>
+                          </w:rPr>
+                          <w:t xml:space="preserve">OF10002</w:t>
+                        </w:r>
+                      </w:sdtContent>
+                    </w:sdt>
+                  </w:p>
+                  <w:p>
+                    <w:pPr>
+                      <w:spacing w:before="0" w:after="0" w:line="220" w:lineRule="auto"/>
+                      <w:jc w:val="left"/>
+                    </w:pPr>
+                    <w:r>
+                      <w:rPr>
+                        <w:rFonts w:ascii="Segoe UI" w:hAnsi="Segoe UI"/>
+                        <w:sz w:val="15"/>
+                        <w:color w:val="1F2937"/>
+                      </w:rPr>
+                      <w:t xml:space="preserve">Regel: </w:t>
+                    </w:r>
+                    <w:sdt>
+                      <w:sdtPr>
+                        <w:alias w:val="#Nav: /PNEPILHeader/PNEPILQuoteResolution/ResolutionSalesQuoteLineNo"/>
+                        <w:tag w:val="#Nav: PNE_PIL_Change_Proposal/50196"/>
+                        <w:id w:val="100205"/>
+                        <w15:dataBinding w:prefixMappings="xmlns:ns0='urn:microsoft-dynamics-nav/reports/PNE_PIL_Change_Proposal/50196/' " w:xpath="/ns0:NavWordReportXmlPart[1]/ns0:PNEPILHeader[1]/ns0:PNEPILQuoteResolution[1]/ns0:ResolutionSalesQuoteLineNo[1]" w:storeItemID="{D387A1D4-2CF1-49BE-83C5-FBD62A1E97C0}"/>
+                        <w:text/>
+                      </w:sdtPr>
+                      <w:sdtContent>
+                        <w:r>
+                          <w:rPr>
+                            <w:rFonts w:ascii="Segoe UI" w:hAnsi="Segoe UI"/>
+                            <w:sz w:val="15"/>
+                            <w:color w:val="1F2937"/>
+                          </w:rPr>
+                          <w:t xml:space="preserve">30000</w:t>
+                        </w:r>
+                      </w:sdtContent>
+                    </w:sdt>
+                  </w:p>
+                  <w:p>
+                    <w:pPr>
+                      <w:spacing w:before="0" w:after="0" w:line="220" w:lineRule="auto"/>
+                      <w:jc w:val="left"/>
+                    </w:pPr>
+                    <w:r>
+                      <w:rPr>
+                        <w:rFonts w:ascii="Segoe UI" w:hAnsi="Segoe UI"/>
+                        <w:sz w:val="15"/>
+                        <w:color w:val="1F2937"/>
+                      </w:rPr>
+                      <w:t xml:space="preserve">Tekst: </w:t>
+                    </w:r>
+                    <w:sdt>
+                      <w:sdtPr>
+                        <w:alias w:val="#Nav: /PNEPILHeader/PNEPILQuoteResolution/ResolutionQuoteLineDescription"/>
+                        <w:tag w:val="#Nav: PNE_PIL_Change_Proposal/50196"/>
+                        <w:id w:val="100212"/>
+                        <w15:dataBinding w:prefixMappings="xmlns:ns0='urn:microsoft-dynamics-nav/reports/PNE_PIL_Change_Proposal/50196/' " w:xpath="/ns0:NavWordReportXmlPart[1]/ns0:PNEPILHeader[1]/ns0:PNEPILQuoteResolution[1]/ns0:ResolutionQuoteLineDescription[1]" w:storeItemID="{D387A1D4-2CF1-49BE-83C5-FBD62A1E97C0}"/>
+                        <w:text/>
+                      </w:sdtPr>
+                      <w:sdtContent>
+                        <w:r>
+                          <w:rPr>
+                            <w:rFonts w:ascii="Segoe UI" w:hAnsi="Segoe UI"/>
+                            <w:sz w:val="15"/>
+                            <w:color w:val="1F2937"/>
+                          </w:rPr>
+                          <w:t xml:space="preserve">Meerwerk volgens PIL</w:t>
+                        </w:r>
+                      </w:sdtContent>
+                    </w:sdt>
+                  </w:p>
+                  <w:p>
+                    <w:pPr>
+                      <w:spacing w:before="0" w:after="0" w:line="220" w:lineRule="auto"/>
+                      <w:jc w:val="left"/>
+                    </w:pPr>
+                    <w:r>
+                      <w:rPr>
+                        <w:rFonts w:ascii="Segoe UI" w:hAnsi="Segoe UI"/>
+                        <w:sz w:val="15"/>
+                        <w:color w:val="1F2937"/>
+                      </w:rPr>
+                      <w:t xml:space="preserve">Prijs: </w:t>
+                    </w:r>
+                    <w:sdt>
+                      <w:sdtPr>
+                        <w:alias w:val="#Nav: /PNEPILHeader/PNEPILQuoteResolution/ResolutionQuoteUnitPrice"/>
+                        <w:tag w:val="#Nav: PNE_PIL_Change_Proposal/50196"/>
+                        <w:id w:val="100213"/>
+                        <w15:dataBinding w:prefixMappings="xmlns:ns0='urn:microsoft-dynamics-nav/reports/PNE_PIL_Change_Proposal/50196/' " w:xpath="/ns0:NavWordReportXmlPart[1]/ns0:PNEPILHeader[1]/ns0:PNEPILQuoteResolution[1]/ns0:ResolutionQuoteUnitPrice[1]" w:storeItemID="{D387A1D4-2CF1-49BE-83C5-FBD62A1E97C0}"/>
+                        <w:text/>
+                      </w:sdtPr>
+                      <w:sdtContent>
+                        <w:r>
+                          <w:rPr>
+                            <w:rFonts w:ascii="Segoe UI" w:hAnsi="Segoe UI"/>
+                            <w:sz w:val="15"/>
+                            <w:color w:val="1F2937"/>
+                          </w:rPr>
+                          <w:t xml:space="preserve">99,35</w:t>
+                        </w:r>
+                      </w:sdtContent>
+                    </w:sdt>
+                    <w:r>
+                      <w:rPr>
+                        <w:rFonts w:ascii="Segoe UI" w:hAnsi="Segoe UI"/>
+                        <w:sz w:val="15"/>
+                        <w:color w:val="1F2937"/>
+                      </w:rPr>
+                      <w:t xml:space="preserve"> | Bedrag: </w:t>
+                    </w:r>
+                    <w:sdt>
+                      <w:sdtPr>
+                        <w:alias w:val="#Nav: /PNEPILHeader/PNEPILQuoteResolution/ResolutionQuoteLineAmount"/>
+                        <w:tag w:val="#Nav: PNE_PIL_Change_Proposal/50196"/>
+                        <w:id w:val="100214"/>
+                        <w15:dataBinding w:prefixMappings="xmlns:ns0='urn:microsoft-dynamics-nav/reports/PNE_PIL_Change_Proposal/50196/' " w:xpath="/ns0:NavWordReportXmlPart[1]/ns0:PNEPILHeader[1]/ns0:PNEPILQuoteResolution[1]/ns0:ResolutionQuoteLineAmount[1]" w:storeItemID="{D387A1D4-2CF1-49BE-83C5-FBD62A1E97C0}"/>
+                        <w:text/>
+                      </w:sdtPr>
+                      <w:sdtContent>
+                        <w:r>
+                          <w:rPr>
+                            <w:rFonts w:ascii="Segoe UI" w:hAnsi="Segoe UI"/>
+                            <w:sz w:val="15"/>
+                            <w:color w:val="1F2937"/>
+                          </w:rPr>
+                          <w:t xml:space="preserve">198,70</w:t>
+                        </w:r>
+                      </w:sdtContent>
+                    </w:sdt>
+                    <w:r>
+                      <w:rPr>
+                        <w:rFonts w:ascii="Segoe UI" w:hAnsi="Segoe UI"/>
+                        <w:sz w:val="15"/>
+                        <w:color w:val="1F2937"/>
+                      </w:rPr>
+                      <w:t xml:space="preserve"> </w:t>
+                    </w:r>
+                    <w:sdt>
+                      <w:sdtPr>
+                        <w:alias w:val="#Nav: /PNEPILHeader/PNEPILQuoteResolution/ResolutionQuoteCurrencyCode"/>
+                        <w:tag w:val="#Nav: PNE_PIL_Change_Proposal/50196"/>
+                        <w:id w:val="100215"/>
+                        <w15:dataBinding w:prefixMappings="xmlns:ns0='urn:microsoft-dynamics-nav/reports/PNE_PIL_Change_Proposal/50196/' " w:xpath="/ns0:NavWordReportXmlPart[1]/ns0:PNEPILHeader[1]/ns0:PNEPILQuoteResolution[1]/ns0:ResolutionQuoteCurrencyCode[1]" w:storeItemID="{D387A1D4-2CF1-49BE-83C5-FBD62A1E97C0}"/>
+                        <w:text/>
+                      </w:sdtPr>
+                      <w:sdtContent>
+                        <w:r>
+                          <w:rPr>
+                            <w:rFonts w:ascii="Segoe UI" w:hAnsi="Segoe UI"/>
+                            <w:sz w:val="15"/>
+                            <w:color w:val="1F2937"/>
+                          </w:rPr>
+                          <w:t xml:space="preserve">EUR</w:t>
+                        </w:r>
+                      </w:sdtContent>
+                    </w:sdt>
+                  </w:p>
+                </w:tc>
+                <w:tc>
+                  <w:tcPr>
+                    <w:tcW w:w="1600" w:type="dxa"/>
+                    <w:vAlign w:val="center"/>
+                    <w:tcMar>
+                      <w:top w:w="70" w:type="dxa"/>
+                      <w:start w:w="90" w:type="dxa"/>
+                      <w:bottom w:w="70" w:type="dxa"/>
+                      <w:end w:w="90" w:type="dxa"/>
+                    </w:tcMar>
+                    <w:tcBorders>
+                      <w:top w:val="single" w:color="D7DEE7" w:sz="3" w:space="0"/>
+                      <w:start w:val="single" w:color="D7DEE7" w:sz="3" w:space="0"/>
+                      <w:bottom w:val="single" w:color="D7DEE7" w:sz="3" w:space="0"/>
+                      <w:end w:val="single" w:color="D7DEE7" w:sz="3" w:space="0"/>
+                    </w:tcBorders>
+                  </w:tcPr>
+                  <w:p>
+                    <w:pPr>
+                      <w:spacing w:before="0" w:after="0" w:line="220" w:lineRule="auto"/>
+                      <w:jc w:val="left"/>
+                    </w:pPr>
+                    <w:sdt>
+                      <w:sdtPr>
+                        <w:alias w:val="#Nav: /PNEPILHeader/PNEPILQuoteResolution/ResolutionCarrierItemNo"/>
+                        <w:tag w:val="#Nav: PNE_PIL_Change_Proposal/50196"/>
+                        <w:id w:val="100206"/>
+                        <w15:dataBinding w:prefixMappings="xmlns:ns0='urn:microsoft-dynamics-nav/reports/PNE_PIL_Change_Proposal/50196/' " w:xpath="/ns0:NavWordReportXmlPart[1]/ns0:PNEPILHeader[1]/ns0:PNEPILQuoteResolution[1]/ns0:ResolutionCarrierItemNo[1]" w:storeItemID="{D387A1D4-2CF1-49BE-83C5-FBD62A1E97C0}"/>
+                        <w:text/>
+                      </w:sdtPr>
+                      <w:sdtContent>
+                        <w:r>
+                          <w:rPr>
+                            <w:rFonts w:ascii="Segoe UI" w:hAnsi="Segoe UI"/>
+                            <w:sz w:val="15"/>
+                            <w:color w:val="1F2937"/>
+                          </w:rPr>
+                          <w:t xml:space="preserve">.EA611100.1</w:t>
+                        </w:r>
+                      </w:sdtContent>
+                    </w:sdt>
+                  </w:p>
+                  <w:p>
+                    <w:pPr>
+                      <w:spacing w:before="0" w:after="0" w:line="220" w:lineRule="auto"/>
+                      <w:jc w:val="left"/>
+                    </w:pPr>
+                    <w:r>
+                      <w:rPr>
+                        <w:rFonts w:ascii="Segoe UI" w:hAnsi="Segoe UI"/>
+                        <w:sz w:val="15"/>
+                        <w:color w:val="1F2937"/>
+                      </w:rPr>
+                      <w:t xml:space="preserve">Variant: </w:t>
+                    </w:r>
+                    <w:sdt>
+                      <w:sdtPr>
+                        <w:alias w:val="#Nav: /PNEPILHeader/PNEPILQuoteResolution/ResolutionCarrierVariantCode"/>
+                        <w:tag w:val="#Nav: PNE_PIL_Change_Proposal/50196"/>
+                        <w:id w:val="100216"/>
+                        <w15:dataBinding w:prefixMappings="xmlns:ns0='urn:microsoft-dynamics-nav/reports/PNE_PIL_Change_Proposal/50196/' " w:xpath="/ns0:NavWordReportXmlPart[1]/ns0:PNEPILHeader[1]/ns0:PNEPILQuoteResolution[1]/ns0:ResolutionCarrierVariantCode[1]" w:storeItemID="{D387A1D4-2CF1-49BE-83C5-FBD62A1E97C0}"/>
+                        <w:text/>
+                      </w:sdtPr>
+                      <w:sdtContent>
+                        <w:r>
+                          <w:rPr>
+                            <w:rFonts w:ascii="Segoe UI" w:hAnsi="Segoe UI"/>
+                            <w:sz w:val="15"/>
+                            <w:color w:val="1F2937"/>
+                          </w:rPr>
+                          <w:t xml:space="preserve">-</w:t>
+                        </w:r>
+                      </w:sdtContent>
+                    </w:sdt>
+                  </w:p>
+                  <w:p>
+                    <w:pPr>
+                      <w:spacing w:before="0" w:after="0" w:line="220" w:lineRule="auto"/>
+                      <w:jc w:val="left"/>
+                    </w:pPr>
+                    <w:r>
+                      <w:rPr>
+                        <w:rFonts w:ascii="Segoe UI" w:hAnsi="Segoe UI"/>
+                        <w:sz w:val="15"/>
+                        <w:color w:val="1F2937"/>
+                      </w:rPr>
+                      <w:t xml:space="preserve">Eenheid: </w:t>
+                    </w:r>
+                    <w:sdt>
+                      <w:sdtPr>
+                        <w:alias w:val="#Nav: /PNEPILHeader/PNEPILQuoteResolution/ResolutionUnitOfMeasureCode"/>
+                        <w:tag w:val="#Nav: PNE_PIL_Change_Proposal/50196"/>
+                        <w:id w:val="100217"/>
+                        <w15:dataBinding w:prefixMappings="xmlns:ns0='urn:microsoft-dynamics-nav/reports/PNE_PIL_Change_Proposal/50196/' " w:xpath="/ns0:NavWordReportXmlPart[1]/ns0:PNEPILHeader[1]/ns0:PNEPILQuoteResolution[1]/ns0:ResolutionUnitOfMeasureCode[1]" w:storeItemID="{D387A1D4-2CF1-49BE-83C5-FBD62A1E97C0}"/>
+                        <w:text/>
+                      </w:sdtPr>
+                      <w:sdtContent>
+                        <w:r>
+                          <w:rPr>
+                            <w:rFonts w:ascii="Segoe UI" w:hAnsi="Segoe UI"/>
+                            <w:sz w:val="15"/>
+                            <w:color w:val="1F2937"/>
+                          </w:rPr>
+                          <w:t xml:space="preserve">STUKS</w:t>
+                        </w:r>
+                      </w:sdtContent>
+                    </w:sdt>
+                  </w:p>
+                </w:tc>
+                <w:tc>
+                  <w:tcPr>
+                    <w:tcW w:w="850" w:type="dxa"/>
+                    <w:vAlign w:val="center"/>
+                    <w:tcMar>
+                      <w:top w:w="70" w:type="dxa"/>
+                      <w:start w:w="90" w:type="dxa"/>
+                      <w:bottom w:w="70" w:type="dxa"/>
+                      <w:end w:w="90" w:type="dxa"/>
+                    </w:tcMar>
+                    <w:tcBorders>
+                      <w:top w:val="single" w:color="D7DEE7" w:sz="3" w:space="0"/>
+                      <w:start w:val="single" w:color="D7DEE7" w:sz="3" w:space="0"/>
+                      <w:bottom w:val="single" w:color="D7DEE7" w:sz="3" w:space="0"/>
+                      <w:end w:val="single" w:color="D7DEE7" w:sz="3" w:space="0"/>
+                    </w:tcBorders>
+                  </w:tcPr>
+                  <w:p>
+                    <w:pPr>
+                      <w:spacing w:before="0" w:after="0" w:line="220" w:lineRule="auto"/>
+                      <w:jc w:val="right"/>
+                    </w:pPr>
+                    <w:sdt>
+                      <w:sdtPr>
+                        <w:alias w:val="#Nav: /PNEPILHeader/PNEPILQuoteResolution/ResolutionQuantity"/>
+                        <w:tag w:val="#Nav: PNE_PIL_Change_Proposal/50196"/>
+                        <w:id w:val="100207"/>
+                        <w15:dataBinding w:prefixMappings="xmlns:ns0='urn:microsoft-dynamics-nav/reports/PNE_PIL_Change_Proposal/50196/' " w:xpath="/ns0:NavWordReportXmlPart[1]/ns0:PNEPILHeader[1]/ns0:PNEPILQuoteResolution[1]/ns0:ResolutionQuantity[1]" w:storeItemID="{D387A1D4-2CF1-49BE-83C5-FBD62A1E97C0}"/>
+                        <w:text/>
+                      </w:sdtPr>
+                      <w:sdtContent>
+                        <w:r>
+                          <w:rPr>
+                            <w:rFonts w:ascii="Segoe UI" w:hAnsi="Segoe UI"/>
+                            <w:sz w:val="15"/>
+                            <w:color w:val="1F2937"/>
+                          </w:rPr>
+                          <w:t xml:space="preserve">2</w:t>
+                        </w:r>
+                      </w:sdtContent>
+                    </w:sdt>
+                  </w:p>
+                </w:tc>
+                <w:tc>
+                  <w:tcPr>
+                    <w:tcW w:w="1050" w:type="dxa"/>
+                    <w:vAlign w:val="center"/>
+                    <w:tcMar>
+                      <w:top w:w="70" w:type="dxa"/>
+                      <w:start w:w="90" w:type="dxa"/>
+                      <w:bottom w:w="70" w:type="dxa"/>
+                      <w:end w:w="90" w:type="dxa"/>
+                    </w:tcMar>
+                    <w:tcBorders>
+                      <w:top w:val="single" w:color="D7DEE7" w:sz="3" w:space="0"/>
+                      <w:start w:val="single" w:color="D7DEE7" w:sz="3" w:space="0"/>
+                      <w:bottom w:val="single" w:color="D7DEE7" w:sz="3" w:space="0"/>
+                      <w:end w:val="single" w:color="D7DEE7" w:sz="3" w:space="0"/>
+                    </w:tcBorders>
+                  </w:tcPr>
+                  <w:p>
+                    <w:pPr>
+                      <w:spacing w:before="0" w:after="0" w:line="220" w:lineRule="auto"/>
+                      <w:jc w:val="right"/>
+                    </w:pPr>
+                    <w:sdt>
+                      <w:sdtPr>
+                        <w:alias w:val="#Nav: /PNEPILHeader/PNEPILQuoteResolution/ResolutionObservedLinkState"/>
+                        <w:tag w:val="#Nav: PNE_PIL_Change_Proposal/50196"/>
+                        <w:id w:val="100208"/>
+                        <w15:dataBinding w:prefixMappings="xmlns:ns0='urn:microsoft-dynamics-nav/reports/PNE_PIL_Change_Proposal/50196/' " w:xpath="/ns0:NavWordReportXmlPart[1]/ns0:PNEPILHeader[1]/ns0:PNEPILQuoteResolution[1]/ns0:ResolutionObservedLinkState[1]" w:storeItemID="{D387A1D4-2CF1-49BE-83C5-FBD62A1E97C0}"/>
+                        <w:text/>
+                      </w:sdtPr>
+                      <w:sdtContent>
+                        <w:r>
+                          <w:rPr>
+                            <w:rFonts w:ascii="Segoe UI" w:hAnsi="Segoe UI"/>
+                            <w:sz w:val="15"/>
+                            <w:color w:val="1F2937"/>
+                          </w:rPr>
+                          <w:t xml:space="preserve">Offertregel ontbreekt</w:t>
+                        </w:r>
+                      </w:sdtContent>
+                    </w:sdt>
+                    <w:r>
+                      <w:br/>
+                    </w:r>
+                    <w:r>
+                      <w:t>Door: </w:t>
+                    </w:r>
+                    <w:sdt>
+                      <w:sdtPr>
+                        <w:alias w:val="#Nav: /PNEPILHeader/PNEPILQuoteResolution/ResolvedBy"/>
+                        <w:tag w:val="#Nav: PNE_PIL_Change_Proposal/50196"/>
+                        <w:id w:val="100209"/>
+                        <w15:dataBinding w:prefixMappings="xmlns:ns0='urn:microsoft-dynamics-nav/reports/PNE_PIL_Change_Proposal/50196/' " w:xpath="/ns0:NavWordReportXmlPart[1]/ns0:PNEPILHeader[1]/ns0:PNEPILQuoteResolution[1]/ns0:ResolvedBy[1]" w:storeItemID="{D387A1D4-2CF1-49BE-83C5-FBD62A1E97C0}"/>
+                        <w:text/>
+                      </w:sdtPr>
+                      <w:sdtContent>
+                        <w:r>
+                          <w:rPr>
+                            <w:rFonts w:ascii="Segoe UI" w:hAnsi="Segoe UI"/>
+                            <w:sz w:val="15"/>
+                            <w:color w:val="1F2937"/>
+                          </w:rPr>
+                          <w:t xml:space="preserve">JVEERMAN</w:t>
+                        </w:r>
+                      </w:sdtContent>
+                    </w:sdt>
+                  </w:p>
+                  <w:p>
+                    <w:pPr>
+                      <w:spacing w:before="0" w:after="0" w:line="220" w:lineRule="auto"/>
+                      <w:jc w:val="right"/>
+                    </w:pPr>
+                    <w:r>
+                      <w:rPr>
+                        <w:rFonts w:ascii="Segoe UI" w:hAnsi="Segoe UI"/>
+                        <w:sz w:val="15"/>
+                        <w:color w:val="1F2937"/>
+                      </w:rPr>
+                      <w:t xml:space="preserve">Op: </w:t>
+                    </w:r>
+                    <w:sdt>
+                      <w:sdtPr>
+                        <w:alias w:val="#Nav: /PNEPILHeader/PNEPILQuoteResolution/ResolvedAt"/>
+                        <w:tag w:val="#Nav: PNE_PIL_Change_Proposal/50196"/>
+                        <w:id w:val="100210"/>
+                        <w15:dataBinding w:prefixMappings="xmlns:ns0='urn:microsoft-dynamics-nav/reports/PNE_PIL_Change_Proposal/50196/' " w:xpath="/ns0:NavWordReportXmlPart[1]/ns0:PNEPILHeader[1]/ns0:PNEPILQuoteResolution[1]/ns0:ResolvedAt[1]" w:storeItemID="{D387A1D4-2CF1-49BE-83C5-FBD62A1E97C0}"/>
+                        <w:text/>
+                      </w:sdtPr>
+                      <w:sdtContent>
+                        <w:r>
+                          <w:rPr>
+                            <w:rFonts w:ascii="Segoe UI" w:hAnsi="Segoe UI"/>
+                            <w:sz w:val="15"/>
+                            <w:color w:val="1F2937"/>
+                          </w:rPr>
+                          <w:t xml:space="preserve">23-08-2026 10:15</w:t>
+                        </w:r>
+                      </w:sdtContent>
+                    </w:sdt>
+                  </w:p>
+                </w:tc>
+                <w:tc>
+                  <w:tcPr>
+                    <w:tcW w:w="5798" w:type="dxa"/>
+                    <w:vAlign w:val="center"/>
+                    <w:tcMar>
+                      <w:top w:w="70" w:type="dxa"/>
+                      <w:start w:w="90" w:type="dxa"/>
+                      <w:bottom w:w="70" w:type="dxa"/>
+                      <w:end w:w="90" w:type="dxa"/>
+                    </w:tcMar>
+                    <w:tcBorders>
+                      <w:top w:val="single" w:color="D7DEE7" w:sz="3" w:space="0"/>
+                      <w:start w:val="single" w:color="D7DEE7" w:sz="3" w:space="0"/>
+                      <w:bottom w:val="single" w:color="D7DEE7" w:sz="3" w:space="0"/>
+                      <w:end w:val="single" w:color="D7DEE7" w:sz="3" w:space="0"/>
+                    </w:tcBorders>
+                  </w:tcPr>
+                  <w:p>
+                    <w:pPr>
+                      <w:spacing w:before="0" w:after="0" w:line="220" w:lineRule="auto"/>
+                      <w:jc w:val="left"/>
+                    </w:pPr>
+                    <w:sdt>
+                      <w:sdtPr>
+                        <w:alias w:val="#Nav: /PNEPILHeader/PNEPILQuoteResolution/ResolutionReason"/>
+                        <w:tag w:val="#Nav: PNE_PIL_Change_Proposal/50196"/>
+                        <w:id w:val="100211"/>
+                        <w15:dataBinding w:prefixMappings="xmlns:ns0='urn:microsoft-dynamics-nav/reports/PNE_PIL_Change_Proposal/50196/' " w:xpath="/ns0:NavWordReportXmlPart[1]/ns0:PNEPILHeader[1]/ns0:PNEPILQuoteResolution[1]/ns0:ResolutionReason[1]" w:storeItemID="{D387A1D4-2CF1-49BE-83C5-FBD62A1E97C0}"/>
+                        <w:text/>
+                      </w:sdtPr>
+                      <w:sdtContent>
+                        <w:r>
+                          <w:rPr>
+                            <w:rFonts w:ascii="Segoe UI" w:hAnsi="Segoe UI"/>
+                            <w:sz w:val="15"/>
+                            <w:color w:val="1F2937"/>
+                          </w:rPr>
+                          <w:t xml:space="preserve">Offerte omgezet; handmatig gecontroleerd en vrijgegeven.</w:t>
+                        </w:r>
+                      </w:sdtContent>
+                    </w:sdt>
+                  </w:p>
+                </w:tc>
+              </w:tr>
+            </w:sdtContent>
+          </w:sdt>
+        </w:sdtContent>
+      </w:sdt>
+    </w:tbl>
+    <w:p>
+      <w:pPr>
         <w:spacing w:before="75" w:after="0" w:line="240" w:lineRule="auto"/>
       </w:pPr>
       <w:r>
@@ -4283,7 +5094,7 @@
       </w:r>
     </w:p>
     <w:sectPr>
-      <w:footerReference w:type="default" r:id="rId3"/>
+      <w:footerReference w:type="default" ns3:id="rId3"/>
       <w:pgSz w:w="16838" w:h="11906" w:orient="landscape"/>
       <w:pgMar w:top="620" w:right="620" w:bottom="620" w:left="620" w:header="360" w:footer="360" w:gutter="0"/>
       <w:cols w:space="708"/>
@@ -4626,6 +5437,8 @@
  
          < R e c o n c i l i a t i o n S t a t u s > R e c o n c i l i a t i o n S t a t u s < / R e c o n c i l i a t i o n S t a t u s >   
+         < R e l e a s e d Q u o t e L i n e C o u n t > R e l e a s e d Q u o t e L i n e C o u n t < / R e l e a s e d Q u o t e L i n e C o u n t > + 
          < R e p o r t D a t e > R e p o r t D a t e < / R e p o r t D a t e >   
          < R e p o r t T i m e > R e p o r t T i m e < / R e p o r t T i m e > @@ -4692,6 +5505,10 @@
  
              < C h a n g e Q u o t e L i n e D e s c r i p t i o n > C h a n g e Q u o t e L i n e D e s c r i p t i o n < / C h a n g e Q u o t e L i n e D e s c r i p t i o n >   
+             < C h a n g e Q u o t e L i n k R e l e a s e d > C h a n g e Q u o t e L i n k R e l e a s e d < / C h a n g e Q u o t e L i n k R e l e a s e d > + 
+             < C h a n g e Q u o t e R e s o l u t i o n E n t r y N o > C h a n g e Q u o t e R e s o l u t i o n E n t r y N o < / C h a n g e Q u o t e R e s o l u t i o n E n t r y N o > + 
              < C h a n g e Q u o t e R e v e r s a l E n t r y N o > C h a n g e Q u o t e R e v e r s a l E n t r y N o < / C h a n g e Q u o t e R e v e r s a l E n t r y N o >   
              < C h a n g e Q u o t e R e v e r s e d > C h a n g e Q u o t e R e v e r s e d < / C h a n g e Q u o t e R e v e r s e d > @@ -4831,6 +5648,46 @@
              < R e v e r s e d B y > R e v e r s e d B y < / R e v e r s e d B y >   
          < / P N E P I L Q u o t e R e v e r s a l > + 
+         < P N E P I L Q u o t e R e s o l u t i o n > + 
+             < R e s o l u t i o n C a r r i e r I t e m N o > R e s o l u t i o n C a r r i e r I t e m N o < / R e s o l u t i o n C a r r i e r I t e m N o > + 
+             < R e s o l u t i o n C a r r i e r V a r i a n t C o d e > R e s o l u t i o n C a r r i e r V a r i a n t C o d e < / R e s o l u t i o n C a r r i e r V a r i a n t C o d e > + 
+             < R e s o l u t i o n C h a n g e L i n e N o > R e s o l u t i o n C h a n g e L i n e N o < / R e s o l u t i o n C h a n g e L i n e N o > + 
+             < R e s o l u t i o n E n t r y N o > R e s o l u t i o n E n t r y N o < / R e s o l u t i o n E n t r y N o > + 
+             < R e s o l u t i o n O b s e r v e d L i n k S t a t e > R e s o l u t i o n O b s e r v e d L i n k S t a t e < / R e s o l u t i o n O b s e r v e d L i n k S t a t e > + 
+             < R e s o l u t i o n Q u a n t i t y > R e s o l u t i o n Q u a n t i t y < / R e s o l u t i o n Q u a n t i t y > + 
+             < R e s o l u t i o n Q u o t e C u r r e n c y C o d e > R e s o l u t i o n Q u o t e C u r r e n c y C o d e < / R e s o l u t i o n Q u o t e C u r r e n c y C o d e > + 
+             < R e s o l u t i o n Q u o t e L i n e A m o u n t > R e s o l u t i o n Q u o t e L i n e A m o u n t < / R e s o l u t i o n Q u o t e L i n e A m o u n t > + 
+             < R e s o l u t i o n Q u o t e L i n e D e s c r i p t i o n > R e s o l u t i o n Q u o t e L i n e D e s c r i p t i o n < / R e s o l u t i o n Q u o t e L i n e D e s c r i p t i o n > + 
+             < R e s o l u t i o n Q u o t e U n i t P r i c e > R e s o l u t i o n Q u o t e U n i t P r i c e < / R e s o l u t i o n Q u o t e U n i t P r i c e > + 
+             < R e s o l u t i o n R e a s o n > R e s o l u t i o n R e a s o n < / R e s o l u t i o n R e a s o n > + 
+             < R e s o l u t i o n S a l e s Q u o t e L i n e M o d i f i e d A t > R e s o l u t i o n S a l e s Q u o t e L i n e M o d i f i e d A t < / R e s o l u t i o n S a l e s Q u o t e L i n e M o d i f i e d A t > + 
+             < R e s o l u t i o n S a l e s Q u o t e L i n e N o > R e s o l u t i o n S a l e s Q u o t e L i n e N o < / R e s o l u t i o n S a l e s Q u o t e L i n e N o > + 
+             < R e s o l u t i o n S a l e s Q u o t e L i n e S y s t e m I d > R e s o l u t i o n S a l e s Q u o t e L i n e S y s t e m I d < / R e s o l u t i o n S a l e s Q u o t e L i n e S y s t e m I d > + 
+             < R e s o l u t i o n S a l e s Q u o t e N o > R e s o l u t i o n S a l e s Q u o t e N o < / R e s o l u t i o n S a l e s Q u o t e N o > + 
+             < R e s o l u t i o n U n i t O f M e a s u r e C o d e > R e s o l u t i o n U n i t O f M e a s u r e C o d e < / R e s o l u t i o n U n i t O f M e a s u r e C o d e > + 
+             < R e s o l v e d A t > R e s o l v e d A t < / R e s o l v e d A t > + 
+             < R e s o l v e d B y > R e s o l v e d B y < / R e s o l v e d B y > + 
+         < / P N E P I L Q u o t e R e s o l u t i o n >   
      < / P N E P I L H e a d e r >   
@@ -4945,6 +5802,8 @@
  
          < R e c o n c i l i a t i o n S t a t u s   E l e m e n t T y p e = " C o l u m n "   E l e m e n t I d = " 2 0 5 5 6 0 8 7 6 2 "   D a t a T y p e = " E n u m " > R e c o n c i l i a t i o n S t a t u s < / R e c o n c i l i a t i o n S t a t u s >   
+         < R e l e a s e d Q u o t e L i n e C o u n t   E l e m e n t T y p e = " C o l u m n "   E l e m e n t I d = " 5 5 3 3 2 0 8 9 5 "   D a t a T y p e = " I n t e g e r " > R e l e a s e d Q u o t e L i n e C o u n t < / R e l e a s e d Q u o t e L i n e C o u n t > + 
          < R e p o r t D a t e   E l e m e n t T y p e = " C o l u m n "   E l e m e n t I d = " 1 6 4 9 6 3 6 2 4 1 "   D a t a T y p e = " T e x t " > R e p o r t D a t e < / R e p o r t D a t e >   
          < R e p o r t T i m e   E l e m e n t T y p e = " C o l u m n "   E l e m e n t I d = " 4 1 8 6 9 1 7 6 2 "   D a t a T y p e = " T e x t " > R e p o r t T i m e < / R e p o r t T i m e > @@ -5011,6 +5870,10 @@
  
              < C h a n g e Q u o t e L i n e D e s c r i p t i o n   E l e m e n t T y p e = " C o l u m n "   E l e m e n t I d = " 7 7 5 4 4 1 1 1 "   D a t a T y p e = " T e x t " > C h a n g e Q u o t e L i n e D e s c r i p t i o n < / C h a n g e Q u o t e L i n e D e s c r i p t i o n >   
+             < C h a n g e Q u o t e L i n k R e l e a s e d   E l e m e n t T y p e = " C o l u m n "   E l e m e n t I d = " 3 3 8 6 1 2 1 4 0 "   D a t a T y p e = " B o o l e a n " > C h a n g e Q u o t e L i n k R e l e a s e d < / C h a n g e Q u o t e L i n k R e l e a s e d > + 
+             < C h a n g e Q u o t e R e s o l u t i o n E n t r y N o   E l e m e n t T y p e = " C o l u m n "   E l e m e n t I d = " 1 5 4 2 0 9 4 8 7 4 "   D a t a T y p e = " I n t e g e r " > C h a n g e Q u o t e R e s o l u t i o n E n t r y N o < / C h a n g e Q u o t e R e s o l u t i o n E n t r y N o > + 
              < C h a n g e Q u o t e R e v e r s a l E n t r y N o   E l e m e n t T y p e = " C o l u m n "   E l e m e n t I d = " 9 5 0 9 5 1 9 6 4 "   D a t a T y p e = " I n t e g e r " > C h a n g e Q u o t e R e v e r s a l E n t r y N o < / C h a n g e Q u o t e R e v e r s a l E n t r y N o >   
              < C h a n g e Q u o t e R e v e r s e d   E l e m e n t T y p e = " C o l u m n "   E l e m e n t I d = " 2 1 1 5 2 2 6 8 7 7 "   D a t a T y p e = " B o o l e a n " > C h a n g e Q u o t e R e v e r s e d < / C h a n g e Q u o t e R e v e r s e d > @@ -5150,6 +6013,46 @@
              < R e v e r s e d B y   E l e m e n t T y p e = " C o l u m n "   E l e m e n t I d = " 1 3 9 2 7 3 1 1 9 4 "   D a t a T y p e = " T e x t " > R e v e r s e d B y < / R e v e r s e d B y >   
          < / P N E P I L Q u o t e R e v e r s a l > + 
+         < P N E P I L Q u o t e R e s o l u t i o n   E l e m e n t T y p e = " D a t a I t e m "   E l e m e n t I d = " 1 2 1 1 6 2 7 9 9 " > + 
+             < R e s o l u t i o n C a r r i e r I t e m N o   E l e m e n t T y p e = " C o l u m n "   E l e m e n t I d = " 1 9 9 5 3 4 9 8 0 3 "   D a t a T y p e = " C o d e " > R e s o l u t i o n C a r r i e r I t e m N o < / R e s o l u t i o n C a r r i e r I t e m N o > + 
+             < R e s o l u t i o n C a r r i e r V a r i a n t C o d e   E l e m e n t T y p e = " C o l u m n "   E l e m e n t I d = " 3 0 2 6 9 5 7 8 7 "   D a t a T y p e = " C o d e " > R e s o l u t i o n C a r r i e r V a r i a n t C o d e < / R e s o l u t i o n C a r r i e r V a r i a n t C o d e > + 
+             < R e s o l u t i o n C h a n g e L i n e N o   E l e m e n t T y p e = " C o l u m n "   E l e m e n t I d = " 3 5 3 4 9 5 7 7 4 "   D a t a T y p e = " I n t e g e r " > R e s o l u t i o n C h a n g e L i n e N o < / R e s o l u t i o n C h a n g e L i n e N o > + 
+             < R e s o l u t i o n E n t r y N o   E l e m e n t T y p e = " C o l u m n "   E l e m e n t I d = " 1 2 8 2 4 2 0 5 7 8 "   D a t a T y p e = " I n t e g e r " > R e s o l u t i o n E n t r y N o < / R e s o l u t i o n E n t r y N o > + 
+             < R e s o l u t i o n O b s e r v e d L i n k S t a t e   E l e m e n t T y p e = " C o l u m n "   E l e m e n t I d = " 1 6 0 1 9 9 9 1 4 6 "   D a t a T y p e = " E n u m " > R e s o l u t i o n O b s e r v e d L i n k S t a t e < / R e s o l u t i o n O b s e r v e d L i n k S t a t e > + 
+             < R e s o l u t i o n Q u a n t i t y   E l e m e n t T y p e = " C o l u m n "   E l e m e n t I d = " 1 6 6 5 7 3 1 1 2 "   D a t a T y p e = " D e c i m a l " > R e s o l u t i o n Q u a n t i t y < / R e s o l u t i o n Q u a n t i t y > + 
+             < R e s o l u t i o n Q u o t e C u r r e n c y C o d e   E l e m e n t T y p e = " C o l u m n "   E l e m e n t I d = " 1 5 8 1 9 2 3 4 9 3 "   D a t a T y p e = " C o d e " > R e s o l u t i o n Q u o t e C u r r e n c y C o d e < / R e s o l u t i o n Q u o t e C u r r e n c y C o d e > + 
+             < R e s o l u t i o n Q u o t e L i n e A m o u n t   E l e m e n t T y p e = " C o l u m n "   E l e m e n t I d = " 5 3 1 3 2 7 6 3 5 "   D a t a T y p e = " D e c i m a l " > R e s o l u t i o n Q u o t e L i n e A m o u n t < / R e s o l u t i o n Q u o t e L i n e A m o u n t > + 
+             < R e s o l u t i o n Q u o t e L i n e D e s c r i p t i o n   E l e m e n t T y p e = " C o l u m n "   E l e m e n t I d = " 1 5 7 2 8 9 3 2 8 1 "   D a t a T y p e = " T e x t " > R e s o l u t i o n Q u o t e L i n e D e s c r i p t i o n < / R e s o l u t i o n Q u o t e L i n e D e s c r i p t i o n > + 
+             < R e s o l u t i o n Q u o t e U n i t P r i c e   E l e m e n t T y p e = " C o l u m n "   E l e m e n t I d = " 1 4 4 9 7 9 1 0 6 "   D a t a T y p e = " D e c i m a l " > R e s o l u t i o n Q u o t e U n i t P r i c e < / R e s o l u t i o n Q u o t e U n i t P r i c e > + 
+             < R e s o l u t i o n R e a s o n   E l e m e n t T y p e = " C o l u m n "   E l e m e n t I d = " 4 8 7 3 8 0 7 6 9 "   D a t a T y p e = " T e x t " > R e s o l u t i o n R e a s o n < / R e s o l u t i o n R e a s o n > + 
+             < R e s o l u t i o n S a l e s Q u o t e L i n e M o d i f i e d A t   E l e m e n t T y p e = " C o l u m n "   E l e m e n t I d = " 8 2 3 7 6 8 8 9 9 "   D a t a T y p e = " D a t e T i m e " > R e s o l u t i o n S a l e s Q u o t e L i n e M o d i f i e d A t < / R e s o l u t i o n S a l e s Q u o t e L i n e M o d i f i e d A t > + 
+             < R e s o l u t i o n S a l e s Q u o t e L i n e N o   E l e m e n t T y p e = " C o l u m n "   E l e m e n t I d = " 1 4 4 9 1 8 2 1 8 2 "   D a t a T y p e = " I n t e g e r " > R e s o l u t i o n S a l e s Q u o t e L i n e N o < / R e s o l u t i o n S a l e s Q u o t e L i n e N o > + 
+             < R e s o l u t i o n S a l e s Q u o t e L i n e S y s t e m I d   E l e m e n t T y p e = " C o l u m n "   E l e m e n t I d = " 8 8 6 3 8 2 7 2 9 "   D a t a T y p e = " G u i d " > R e s o l u t i o n S a l e s Q u o t e L i n e S y s t e m I d < / R e s o l u t i o n S a l e s Q u o t e L i n e S y s t e m I d > + 
+             < R e s o l u t i o n S a l e s Q u o t e N o   E l e m e n t T y p e = " C o l u m n "   E l e m e n t I d = " 2 1 2 4 1 7 5 2 4 0 "   D a t a T y p e = " C o d e " > R e s o l u t i o n S a l e s Q u o t e N o < / R e s o l u t i o n S a l e s Q u o t e N o > + 
+             < R e s o l u t i o n U n i t O f M e a s u r e C o d e   E l e m e n t T y p e = " C o l u m n "   E l e m e n t I d = " 3 3 8 5 6 3 1 5 3 "   D a t a T y p e = " C o d e " > R e s o l u t i o n U n i t O f M e a s u r e C o d e < / R e s o l u t i o n U n i t O f M e a s u r e C o d e > + 
+             < R e s o l v e d A t   E l e m e n t T y p e = " C o l u m n "   E l e m e n t I d = " 1 4 6 7 8 2 9 4 0 8 "   D a t a T y p e = " D a t e T i m e " > R e s o l v e d A t < / R e s o l v e d A t > + 
+             < R e s o l v e d B y   E l e m e n t T y p e = " C o l u m n "   E l e m e n t I d = " 1 2 6 6 8 2 0 9 6 6 "   D a t a T y p e = " T e x t " > R e s o l v e d B y < / R e s o l v e d B y > + 
+         < / P N E P I L Q u o t e R e s o l u t i o n >   
      < / P N E P I L H e a d e r >   

</xml_diff>